<commit_message>
Sommaire sans liens cliquables sur la page des procédures
Co-Authored-By: Claude Opus 5 <noreply@anthropic.com>
</commit_message>
<xml_diff>
--- a/fichiers/2 - Texte a coller dans l'IA.docx
+++ b/fichiers/2 - Texte a coller dans l'IA.docx
@@ -1995,70 +1995,43 @@
           <w:rFonts w:ascii="Consolas" w:hAnsi="Consolas" w:eastAsia="Consolas"/>
           <w:sz w:val="18"/>
         </w:rPr>
-        <w:t xml:space="preserve">    vraiment à se repérer dans une longue procédure. Dans le fichier Word, ce</w:t>
-      </w:r>
-    </w:p>
-    <w:p>
-      <w:r>
-        <w:rPr>
-          <w:rFonts w:ascii="Consolas" w:hAnsi="Consolas" w:eastAsia="Consolas"/>
-          <w:sz w:val="18"/>
-        </w:rPr>
-        <w:t xml:space="preserve">    sommaire est une vraie table des matières Word, celle qui se met à jour</w:t>
-      </w:r>
-    </w:p>
-    <w:p>
-      <w:r>
-        <w:rPr>
-          <w:rFonts w:ascii="Consolas" w:hAnsi="Consolas" w:eastAsia="Consolas"/>
-          <w:sz w:val="18"/>
-        </w:rPr>
-        <w:t xml:space="preserve">    toute seule. Si tu me donnes du texte au lieu d'un fichier, écris chaque</w:t>
-      </w:r>
-    </w:p>
-    <w:p>
-      <w:r>
-        <w:rPr>
-          <w:rFonts w:ascii="Consolas" w:hAnsi="Consolas" w:eastAsia="Consolas"/>
-          <w:sz w:val="18"/>
-        </w:rPr>
-        <w:t xml:space="preserve">    entrée comme un lien vers son titre, sur ce modèle :</w:t>
-      </w:r>
-    </w:p>
-    <w:p>
-      <w:r>
-        <w:rPr>
-          <w:rFonts w:ascii="Consolas" w:hAnsi="Consolas" w:eastAsia="Consolas"/>
-          <w:sz w:val="18"/>
-        </w:rPr>
-        <w:t xml:space="preserve">       - [Étapes](#étapes)</w:t>
-      </w:r>
-    </w:p>
-    <w:p>
-      <w:r>
-        <w:rPr>
-          <w:rFonts w:ascii="Consolas" w:hAnsi="Consolas" w:eastAsia="Consolas"/>
-          <w:sz w:val="18"/>
-        </w:rPr>
-        <w:t xml:space="preserve">         1. [Extraire la liste des clients](#1-extraire-la-liste-des-clients)</w:t>
-      </w:r>
-    </w:p>
-    <w:p>
-      <w:r>
-        <w:rPr>
-          <w:rFonts w:ascii="Consolas" w:hAnsi="Consolas" w:eastAsia="Consolas"/>
-          <w:sz w:val="18"/>
-        </w:rPr>
-        <w:t xml:space="preserve">    l'ancre étant le titre en minuscules, espaces remplacés par des tirets et</w:t>
-      </w:r>
-    </w:p>
-    <w:p>
-      <w:r>
-        <w:rPr>
-          <w:rFonts w:ascii="Consolas" w:hAnsi="Consolas" w:eastAsia="Consolas"/>
-          <w:sz w:val="18"/>
-        </w:rPr>
-        <w:t xml:space="preserve">    ponctuation retirée.</w:t>
+        <w:t xml:space="preserve">    vraiment à se repérer dans une longue procédure.</w:t>
+      </w:r>
+    </w:p>
+    <w:p>
+      <w:r>
+        <w:rPr>
+          <w:rFonts w:ascii="Consolas" w:hAnsi="Consolas" w:eastAsia="Consolas"/>
+          <w:sz w:val="18"/>
+        </w:rPr>
+        <w:t xml:space="preserve">    **Une simple liste, sans aucun lien cliquable ni renvoi automatique.**</w:t>
+      </w:r>
+    </w:p>
+    <w:p>
+      <w:r>
+        <w:rPr>
+          <w:rFonts w:ascii="Consolas" w:hAnsi="Consolas" w:eastAsia="Consolas"/>
+          <w:sz w:val="18"/>
+        </w:rPr>
+        <w:t xml:space="preserve">    N'essaie pas d'insérer une table des matières qui se met à jour : le</w:t>
+      </w:r>
+    </w:p>
+    <w:p>
+      <w:r>
+        <w:rPr>
+          <w:rFonts w:ascii="Consolas" w:hAnsi="Consolas" w:eastAsia="Consolas"/>
+          <w:sz w:val="18"/>
+        </w:rPr>
+        <w:t xml:space="preserve">    résultat est rarement propre. Les titres sont hiérarchisés par les styles</w:t>
+      </w:r>
+    </w:p>
+    <w:p>
+      <w:r>
+        <w:rPr>
+          <w:rFonts w:ascii="Consolas" w:hAnsi="Consolas" w:eastAsia="Consolas"/>
+          <w:sz w:val="18"/>
+        </w:rPr>
+        <w:t xml:space="preserve">    Word, ce qui suffit à qui voudra en générer une lui-même.</w:t>
       </w:r>
     </w:p>
     <w:p>

</xml_diff>